<commit_message>
AI reports added (all employees performance, manager performance, department performance) and ui for small screen fixed. all datatables and view sidebar ui improved. dashboard ui and ux improved
</commit_message>
<xml_diff>
--- a/scratch/aligned_sample.docx
+++ b/scratch/aligned_sample.docx
@@ -30,7 +30,7 @@
           <w:sz w:val="18"/>
           <w:szCs w:val="18"/>
         </w:rPr>
-        <w:t xml:space="preserve">Generated: 13/8/2026, 10:33:57 am | Role: ADMIN | Subject: Company-Wide Analysis</w:t>
+        <w:t xml:space="preserve">Generated: 14/8/2026, 10:24:10 am | Role: ADMIN | Subject: Company-Wide Analysis</w:t>
       </w:r>
     </w:p>
     <w:p>
@@ -99,6 +99,72 @@
           </w:tcPr>
           <w:p>
             <w:r>
+              <w:t xml:space="preserve">Total Employees</w:t>
+            </w:r>
+          </w:p>
+        </w:tc>
+        <w:tc>
+          <w:tcPr>
+            <w:tcW w:type="pct" w:w="50%"/>
+          </w:tcPr>
+          <w:p>
+            <w:r>
+              <w:t xml:space="preserve">—</w:t>
+            </w:r>
+          </w:p>
+        </w:tc>
+      </w:tr>
+      <w:tr>
+        <w:tc>
+          <w:tcPr>
+            <w:tcW w:type="pct" w:w="50%"/>
+          </w:tcPr>
+          <w:p>
+            <w:r>
+              <w:t xml:space="preserve">Total Managers</w:t>
+            </w:r>
+          </w:p>
+        </w:tc>
+        <w:tc>
+          <w:tcPr>
+            <w:tcW w:type="pct" w:w="50%"/>
+          </w:tcPr>
+          <w:p>
+            <w:r>
+              <w:t xml:space="preserve">—</w:t>
+            </w:r>
+          </w:p>
+        </w:tc>
+      </w:tr>
+      <w:tr>
+        <w:tc>
+          <w:tcPr>
+            <w:tcW w:type="pct" w:w="50%"/>
+          </w:tcPr>
+          <w:p>
+            <w:r>
+              <w:t xml:space="preserve">Total Projects</w:t>
+            </w:r>
+          </w:p>
+        </w:tc>
+        <w:tc>
+          <w:tcPr>
+            <w:tcW w:type="pct" w:w="50%"/>
+          </w:tcPr>
+          <w:p>
+            <w:r>
+              <w:t xml:space="preserve">—</w:t>
+            </w:r>
+          </w:p>
+        </w:tc>
+      </w:tr>
+      <w:tr>
+        <w:tc>
+          <w:tcPr>
+            <w:tcW w:type="pct" w:w="50%"/>
+          </w:tcPr>
+          <w:p>
+            <w:r>
               <w:t xml:space="preserve">Total Tasks</w:t>
             </w:r>
           </w:p>
@@ -109,7 +175,7 @@
           </w:tcPr>
           <w:p>
             <w:r>
-              <w:t xml:space="preserve">42</w:t>
+              <w:t xml:space="preserve">—</w:t>
             </w:r>
           </w:p>
         </w:tc>
@@ -131,7 +197,7 @@
           </w:tcPr>
           <w:p>
             <w:r>
-              <w:t xml:space="preserve">18</w:t>
+              <w:t xml:space="preserve">—</w:t>
             </w:r>
           </w:p>
         </w:tc>
@@ -153,29 +219,29 @@
           </w:tcPr>
           <w:p>
             <w:r>
-              <w:t xml:space="preserve">24</w:t>
-            </w:r>
-          </w:p>
-        </w:tc>
-      </w:tr>
-      <w:tr>
-        <w:tc>
-          <w:tcPr>
-            <w:tcW w:type="pct" w:w="50%"/>
-          </w:tcPr>
-          <w:p>
-            <w:r>
-              <w:t xml:space="preserve">Completion Rate</w:t>
-            </w:r>
-          </w:p>
-        </w:tc>
-        <w:tc>
-          <w:tcPr>
-            <w:tcW w:type="pct" w:w="50%"/>
-          </w:tcPr>
-          <w:p>
-            <w:r>
-              <w:t xml:space="preserve">78%</w:t>
+              <w:t xml:space="preserve">—</w:t>
+            </w:r>
+          </w:p>
+        </w:tc>
+      </w:tr>
+      <w:tr>
+        <w:tc>
+          <w:tcPr>
+            <w:tcW w:type="pct" w:w="50%"/>
+          </w:tcPr>
+          <w:p>
+            <w:r>
+              <w:t xml:space="preserve">Task Completion Rate</w:t>
+            </w:r>
+          </w:p>
+        </w:tc>
+        <w:tc>
+          <w:tcPr>
+            <w:tcW w:type="pct" w:w="50%"/>
+          </w:tcPr>
+          <w:p>
+            <w:r>
+              <w:t xml:space="preserve">—</w:t>
             </w:r>
           </w:p>
         </w:tc>
@@ -197,7 +263,7 @@
           </w:tcPr>
           <w:p>
             <w:r>
-              <w:t xml:space="preserve">3</w:t>
+              <w:t xml:space="preserve">—</w:t>
             </w:r>
           </w:p>
         </w:tc>
@@ -219,51 +285,29 @@
           </w:tcPr>
           <w:p>
             <w:r>
-              <w:t xml:space="preserve">4</w:t>
-            </w:r>
-          </w:p>
-        </w:tc>
-      </w:tr>
-      <w:tr>
-        <w:tc>
-          <w:tcPr>
-            <w:tcW w:type="pct" w:w="50%"/>
-          </w:tcPr>
-          <w:p>
-            <w:r>
-              <w:t xml:space="preserve">Department Count</w:t>
-            </w:r>
-          </w:p>
-        </w:tc>
-        <w:tc>
-          <w:tcPr>
-            <w:tcW w:type="pct" w:w="50%"/>
-          </w:tcPr>
-          <w:p>
-            <w:r>
-              <w:t xml:space="preserve">3</w:t>
-            </w:r>
-          </w:p>
-        </w:tc>
-      </w:tr>
-      <w:tr>
-        <w:tc>
-          <w:tcPr>
-            <w:tcW w:type="pct" w:w="50%"/>
-          </w:tcPr>
-          <w:p>
-            <w:r>
-              <w:t xml:space="preserve">Manager Count</w:t>
-            </w:r>
-          </w:p>
-        </w:tc>
-        <w:tc>
-          <w:tcPr>
-            <w:tcW w:type="pct" w:w="50%"/>
-          </w:tcPr>
-          <w:p>
-            <w:r>
-              <w:t xml:space="preserve">2</w:t>
+              <w:t xml:space="preserve">—</w:t>
+            </w:r>
+          </w:p>
+        </w:tc>
+      </w:tr>
+      <w:tr>
+        <w:tc>
+          <w:tcPr>
+            <w:tcW w:type="pct" w:w="50%"/>
+          </w:tcPr>
+          <w:p>
+            <w:r>
+              <w:t xml:space="preserve">High-Priority Overdue</w:t>
+            </w:r>
+          </w:p>
+        </w:tc>
+        <w:tc>
+          <w:tcPr>
+            <w:tcW w:type="pct" w:w="50%"/>
+          </w:tcPr>
+          <w:p>
+            <w:r>
+              <w:t xml:space="preserve">—</w:t>
             </w:r>
           </w:p>
         </w:tc>

</xml_diff>